<commit_message>
feat: implement P17 grounded generation and evidence retrieval
</commit_message>
<xml_diff>
--- a/docs/assignment_docs/CareerOS_features_doc.docx
+++ b/docs/assignment_docs/CareerOS_features_doc.docx
@@ -8,6 +8,8 @@
         <w:rPr>
           <w:rFonts w:ascii="Times New Roman" w:eastAsia="Times New Roman" w:hAnsi="Times New Roman" w:cs="Times New Roman"/>
           <w:kern w:val="0"/>
+          <w:sz w:val="36"/>
+          <w:szCs w:val="36"/>
           <w14:ligatures w14:val="none"/>
         </w:rPr>
       </w:pPr>
@@ -17,6 +19,8 @@
           <w:b/>
           <w:bCs/>
           <w:kern w:val="0"/>
+          <w:sz w:val="36"/>
+          <w:szCs w:val="36"/>
           <w14:ligatures w14:val="none"/>
         </w:rPr>
         <w:t>Title:</w:t>
@@ -25,6 +29,8 @@
         <w:rPr>
           <w:rFonts w:ascii="Times New Roman" w:eastAsia="Times New Roman" w:hAnsi="Times New Roman" w:cs="Times New Roman"/>
           <w:kern w:val="0"/>
+          <w:sz w:val="36"/>
+          <w:szCs w:val="36"/>
           <w14:ligatures w14:val="none"/>
         </w:rPr>
         <w:t xml:space="preserve"> </w:t>
@@ -35,6 +41,8 @@
           <w:b/>
           <w:bCs/>
           <w:kern w:val="0"/>
+          <w:sz w:val="36"/>
+          <w:szCs w:val="36"/>
           <w14:ligatures w14:val="none"/>
         </w:rPr>
         <w:t>CareerOS — Full Feature List (Ranked by Value) Based on Product Architecture</w:t>
@@ -43,6 +51,8 @@
         <w:rPr>
           <w:rFonts w:ascii="Times New Roman" w:eastAsia="Times New Roman" w:hAnsi="Times New Roman" w:cs="Times New Roman"/>
           <w:kern w:val="0"/>
+          <w:sz w:val="36"/>
+          <w:szCs w:val="36"/>
           <w14:ligatures w14:val="none"/>
         </w:rPr>
         <w:br/>
@@ -53,6 +63,8 @@
           <w:b/>
           <w:bCs/>
           <w:kern w:val="0"/>
+          <w:sz w:val="36"/>
+          <w:szCs w:val="36"/>
           <w14:ligatures w14:val="none"/>
         </w:rPr>
         <w:t>Course Assignment 3 — Part 1</w:t>
@@ -61,6 +73,8 @@
         <w:rPr>
           <w:rFonts w:ascii="Times New Roman" w:eastAsia="Times New Roman" w:hAnsi="Times New Roman" w:cs="Times New Roman"/>
           <w:kern w:val="0"/>
+          <w:sz w:val="36"/>
+          <w:szCs w:val="36"/>
           <w14:ligatures w14:val="none"/>
         </w:rPr>
         <w:br/>
@@ -71,6 +85,8 @@
           <w:b/>
           <w:bCs/>
           <w:kern w:val="0"/>
+          <w:sz w:val="36"/>
+          <w:szCs w:val="36"/>
           <w14:ligatures w14:val="none"/>
         </w:rPr>
         <w:t>Student:</w:t>
@@ -79,6 +95,8 @@
         <w:rPr>
           <w:rFonts w:ascii="Times New Roman" w:eastAsia="Times New Roman" w:hAnsi="Times New Roman" w:cs="Times New Roman"/>
           <w:kern w:val="0"/>
+          <w:sz w:val="36"/>
+          <w:szCs w:val="36"/>
           <w14:ligatures w14:val="none"/>
         </w:rPr>
         <w:t xml:space="preserve"> Ganesh Prasad Bhandari</w:t>
@@ -87,6 +105,8 @@
         <w:rPr>
           <w:rFonts w:ascii="Times New Roman" w:eastAsia="Times New Roman" w:hAnsi="Times New Roman" w:cs="Times New Roman"/>
           <w:kern w:val="0"/>
+          <w:sz w:val="36"/>
+          <w:szCs w:val="36"/>
           <w14:ligatures w14:val="none"/>
         </w:rPr>
         <w:br/>
@@ -97,6 +117,8 @@
           <w:b/>
           <w:bCs/>
           <w:kern w:val="0"/>
+          <w:sz w:val="36"/>
+          <w:szCs w:val="36"/>
           <w14:ligatures w14:val="none"/>
         </w:rPr>
         <w:t>Project:</w:t>
@@ -105,6 +127,8 @@
         <w:rPr>
           <w:rFonts w:ascii="Times New Roman" w:eastAsia="Times New Roman" w:hAnsi="Times New Roman" w:cs="Times New Roman"/>
           <w:kern w:val="0"/>
+          <w:sz w:val="36"/>
+          <w:szCs w:val="36"/>
           <w14:ligatures w14:val="none"/>
         </w:rPr>
         <w:t xml:space="preserve"> CareerOS (Agentic AI Capstone)</w:t>
@@ -113,6 +137,8 @@
         <w:rPr>
           <w:rFonts w:ascii="Times New Roman" w:eastAsia="Times New Roman" w:hAnsi="Times New Roman" w:cs="Times New Roman"/>
           <w:kern w:val="0"/>
+          <w:sz w:val="36"/>
+          <w:szCs w:val="36"/>
           <w14:ligatures w14:val="none"/>
         </w:rPr>
         <w:br/>
@@ -123,6 +149,8 @@
           <w:b/>
           <w:bCs/>
           <w:kern w:val="0"/>
+          <w:sz w:val="36"/>
+          <w:szCs w:val="36"/>
           <w14:ligatures w14:val="none"/>
         </w:rPr>
         <w:t>Date:</w:t>
@@ -131,6 +159,8 @@
         <w:rPr>
           <w:rFonts w:ascii="Times New Roman" w:eastAsia="Times New Roman" w:hAnsi="Times New Roman" w:cs="Times New Roman"/>
           <w:kern w:val="0"/>
+          <w:sz w:val="36"/>
+          <w:szCs w:val="36"/>
           <w14:ligatures w14:val="none"/>
         </w:rPr>
         <w:t xml:space="preserve"> Feb 2026</w:t>
@@ -150,18 +180,9 @@
           <w:rFonts w:ascii="Times New Roman" w:eastAsia="Times New Roman" w:hAnsi="Times New Roman" w:cs="Times New Roman"/>
           <w:noProof/>
           <w:kern w:val="0"/>
-          <w14:ligatures w14:val="none"/>
-        </w:rPr>
-      </w:r>
-      <w:r>
-        <w:rPr>
-          <w:rFonts w:ascii="Times New Roman" w:eastAsia="Times New Roman" w:hAnsi="Times New Roman" w:cs="Times New Roman"/>
-          <w:noProof/>
-          <w:kern w:val="0"/>
-          <w14:ligatures w14:val="none"/>
-        </w:rPr>
-        <w:pict w14:anchorId="0A2E4044">
-          <v:rect id="_x0000_i1025" alt="" style="width:468pt;height:.05pt;mso-width-percent:0;mso-height-percent:0;mso-width-percent:0;mso-height-percent:0" o:hralign="center" o:hrstd="t" o:hr="t" fillcolor="#a0a0a0" stroked="f"/>
+        </w:rPr>
+        <w:pict w14:anchorId="2578AA3E">
+          <v:rect id="_x0000_i1036" alt="" style="width:468pt;height:.05pt;mso-width-percent:0;mso-height-percent:0;mso-width-percent:0;mso-height-percent:0" o:hralign="center" o:hrstd="t" o:hr="t" fillcolor="#a0a0a0" stroked="f"/>
         </w:pict>
       </w:r>
     </w:p>
@@ -251,18 +272,9 @@
           <w:rFonts w:ascii="Times New Roman" w:eastAsia="Times New Roman" w:hAnsi="Times New Roman" w:cs="Times New Roman"/>
           <w:noProof/>
           <w:kern w:val="0"/>
-          <w14:ligatures w14:val="none"/>
-        </w:rPr>
-      </w:r>
-      <w:r>
-        <w:rPr>
-          <w:rFonts w:ascii="Times New Roman" w:eastAsia="Times New Roman" w:hAnsi="Times New Roman" w:cs="Times New Roman"/>
-          <w:noProof/>
-          <w:kern w:val="0"/>
-          <w14:ligatures w14:val="none"/>
-        </w:rPr>
-        <w:pict w14:anchorId="2B6418CB">
-          <v:rect id="_x0000_i1026" alt="" style="width:468pt;height:.05pt;mso-width-percent:0;mso-height-percent:0;mso-width-percent:0;mso-height-percent:0" o:hralign="center" o:hrstd="t" o:hr="t" fillcolor="#a0a0a0" stroked="f"/>
+        </w:rPr>
+        <w:pict w14:anchorId="41E70222">
+          <v:rect id="_x0000_i1035" alt="" style="width:468pt;height:.05pt;mso-width-percent:0;mso-height-percent:0;mso-width-percent:0;mso-height-percent:0" o:hralign="center" o:hrstd="t" o:hr="t" fillcolor="#a0a0a0" stroked="f"/>
         </w:pict>
       </w:r>
     </w:p>
@@ -453,18 +465,9 @@
           <w:rFonts w:ascii="Times New Roman" w:eastAsia="Times New Roman" w:hAnsi="Times New Roman" w:cs="Times New Roman"/>
           <w:noProof/>
           <w:kern w:val="0"/>
-          <w14:ligatures w14:val="none"/>
-        </w:rPr>
-      </w:r>
-      <w:r>
-        <w:rPr>
-          <w:rFonts w:ascii="Times New Roman" w:eastAsia="Times New Roman" w:hAnsi="Times New Roman" w:cs="Times New Roman"/>
-          <w:noProof/>
-          <w:kern w:val="0"/>
-          <w14:ligatures w14:val="none"/>
-        </w:rPr>
-        <w:pict w14:anchorId="3A17DE0A">
-          <v:rect id="_x0000_i1027" alt="" style="width:468pt;height:.05pt;mso-width-percent:0;mso-height-percent:0;mso-width-percent:0;mso-height-percent:0" o:hralign="center" o:hrstd="t" o:hr="t" fillcolor="#a0a0a0" stroked="f"/>
+        </w:rPr>
+        <w:pict w14:anchorId="686AFF0D">
+          <v:rect id="_x0000_i1034" alt="" style="width:468pt;height:.05pt;mso-width-percent:0;mso-height-percent:0;mso-width-percent:0;mso-height-percent:0" o:hralign="center" o:hrstd="t" o:hr="t" fillcolor="#a0a0a0" stroked="f"/>
         </w:pict>
       </w:r>
     </w:p>
@@ -477,8 +480,8 @@
           <w:b/>
           <w:bCs/>
           <w:kern w:val="36"/>
-          <w:sz w:val="48"/>
-          <w:szCs w:val="48"/>
+          <w:sz w:val="36"/>
+          <w:szCs w:val="36"/>
           <w14:ligatures w14:val="none"/>
         </w:rPr>
       </w:pPr>
@@ -488,8 +491,8 @@
           <w:b/>
           <w:bCs/>
           <w:kern w:val="36"/>
-          <w:sz w:val="48"/>
-          <w:szCs w:val="48"/>
+          <w:sz w:val="36"/>
+          <w:szCs w:val="36"/>
           <w14:ligatures w14:val="none"/>
         </w:rPr>
         <w:t>3) Full feature list (ranked by value) — organized by architecture layers (L1–L9)</w:t>
@@ -625,6 +628,7 @@
           <w:kern w:val="0"/>
           <w14:ligatures w14:val="none"/>
         </w:rPr>
+        <w:lastRenderedPageBreak/>
         <w:t>F2. Guided Intake Wizard (Resume + constraints + targets) — Value: 4/5</w:t>
       </w:r>
     </w:p>
@@ -669,7 +673,6 @@
           <w:kern w:val="0"/>
           <w14:ligatures w14:val="none"/>
         </w:rPr>
-        <w:lastRenderedPageBreak/>
         <w:t>Output: validated intake bundle</w:t>
       </w:r>
     </w:p>
@@ -709,18 +712,9 @@
           <w:rFonts w:ascii="Times New Roman" w:eastAsia="Times New Roman" w:hAnsi="Times New Roman" w:cs="Times New Roman"/>
           <w:noProof/>
           <w:kern w:val="0"/>
-          <w14:ligatures w14:val="none"/>
-        </w:rPr>
-      </w:r>
-      <w:r>
-        <w:rPr>
-          <w:rFonts w:ascii="Times New Roman" w:eastAsia="Times New Roman" w:hAnsi="Times New Roman" w:cs="Times New Roman"/>
-          <w:noProof/>
-          <w:kern w:val="0"/>
-          <w14:ligatures w14:val="none"/>
-        </w:rPr>
-        <w:pict w14:anchorId="40AE0B9C">
-          <v:rect id="_x0000_i1028" alt="" style="width:468pt;height:.05pt;mso-width-percent:0;mso-height-percent:0;mso-width-percent:0;mso-height-percent:0" o:hralign="center" o:hrstd="t" o:hr="t" fillcolor="#a0a0a0" stroked="f"/>
+        </w:rPr>
+        <w:pict w14:anchorId="12724CDE">
+          <v:rect id="_x0000_i1033" alt="" style="width:468pt;height:.05pt;mso-width-percent:0;mso-height-percent:0;mso-width-percent:0;mso-height-percent:0" o:hralign="center" o:hrstd="t" o:hr="t" fillcolor="#a0a0a0" stroked="f"/>
         </w:pict>
       </w:r>
     </w:p>
@@ -937,18 +931,9 @@
           <w:rFonts w:ascii="Times New Roman" w:eastAsia="Times New Roman" w:hAnsi="Times New Roman" w:cs="Times New Roman"/>
           <w:noProof/>
           <w:kern w:val="0"/>
-          <w14:ligatures w14:val="none"/>
-        </w:rPr>
-      </w:r>
-      <w:r>
-        <w:rPr>
-          <w:rFonts w:ascii="Times New Roman" w:eastAsia="Times New Roman" w:hAnsi="Times New Roman" w:cs="Times New Roman"/>
-          <w:noProof/>
-          <w:kern w:val="0"/>
-          <w14:ligatures w14:val="none"/>
-        </w:rPr>
-        <w:pict w14:anchorId="700041AD">
-          <v:rect id="_x0000_i1029" alt="" style="width:468pt;height:.05pt;mso-width-percent:0;mso-height-percent:0;mso-width-percent:0;mso-height-percent:0" o:hralign="center" o:hrstd="t" o:hr="t" fillcolor="#a0a0a0" stroked="f"/>
+        </w:rPr>
+        <w:pict w14:anchorId="2823B584">
+          <v:rect id="_x0000_i1032" alt="" style="width:468pt;height:.05pt;mso-width-percent:0;mso-height-percent:0;mso-width-percent:0;mso-height-percent:0" o:hralign="center" o:hrstd="t" o:hr="t" fillcolor="#a0a0a0" stroked="f"/>
         </w:pict>
       </w:r>
     </w:p>
@@ -1040,27 +1025,7 @@
           <w:kern w:val="0"/>
           <w14:ligatures w14:val="none"/>
         </w:rPr>
-        <w:t xml:space="preserve">Output: </w:t>
-      </w:r>
-      <w:proofErr w:type="spellStart"/>
-      <w:proofErr w:type="gramStart"/>
-      <w:r>
-        <w:rPr>
-          <w:rFonts w:ascii="Times New Roman" w:eastAsia="Times New Roman" w:hAnsi="Times New Roman" w:cs="Times New Roman"/>
-          <w:kern w:val="0"/>
-          <w14:ligatures w14:val="none"/>
-        </w:rPr>
-        <w:t>profile.json</w:t>
-      </w:r>
-      <w:proofErr w:type="spellEnd"/>
-      <w:proofErr w:type="gramEnd"/>
-      <w:r>
-        <w:rPr>
-          <w:rFonts w:ascii="Times New Roman" w:eastAsia="Times New Roman" w:hAnsi="Times New Roman" w:cs="Times New Roman"/>
-          <w:kern w:val="0"/>
-          <w14:ligatures w14:val="none"/>
-        </w:rPr>
-        <w:t xml:space="preserve"> with skills, roles, projects, timeline</w:t>
+        <w:t>Output: profile.json with skills, roles, projects, timeline</w:t>
       </w:r>
     </w:p>
     <w:p>
@@ -1124,27 +1089,7 @@
           <w:kern w:val="0"/>
           <w14:ligatures w14:val="none"/>
         </w:rPr>
-        <w:t xml:space="preserve">Inputs: </w:t>
-      </w:r>
-      <w:proofErr w:type="spellStart"/>
-      <w:proofErr w:type="gramStart"/>
-      <w:r>
-        <w:rPr>
-          <w:rFonts w:ascii="Times New Roman" w:eastAsia="Times New Roman" w:hAnsi="Times New Roman" w:cs="Times New Roman"/>
-          <w:kern w:val="0"/>
-          <w14:ligatures w14:val="none"/>
-        </w:rPr>
-        <w:t>profile.json</w:t>
-      </w:r>
-      <w:proofErr w:type="spellEnd"/>
-      <w:proofErr w:type="gramEnd"/>
-      <w:r>
-        <w:rPr>
-          <w:rFonts w:ascii="Times New Roman" w:eastAsia="Times New Roman" w:hAnsi="Times New Roman" w:cs="Times New Roman"/>
-          <w:kern w:val="0"/>
-          <w14:ligatures w14:val="none"/>
-        </w:rPr>
-        <w:t xml:space="preserve"> + optional project links/snippets</w:t>
+        <w:t>Inputs: profile.json + optional project links/snippets</w:t>
       </w:r>
     </w:p>
     <w:p>
@@ -1166,35 +1111,7 @@
           <w:kern w:val="0"/>
           <w14:ligatures w14:val="none"/>
         </w:rPr>
-        <w:t xml:space="preserve">Output: </w:t>
-      </w:r>
-      <w:proofErr w:type="spellStart"/>
-      <w:r>
-        <w:rPr>
-          <w:rFonts w:ascii="Times New Roman" w:eastAsia="Times New Roman" w:hAnsi="Times New Roman" w:cs="Times New Roman"/>
-          <w:kern w:val="0"/>
-          <w14:ligatures w14:val="none"/>
-        </w:rPr>
-        <w:t>evidence_</w:t>
-      </w:r>
-      <w:proofErr w:type="gramStart"/>
-      <w:r>
-        <w:rPr>
-          <w:rFonts w:ascii="Times New Roman" w:eastAsia="Times New Roman" w:hAnsi="Times New Roman" w:cs="Times New Roman"/>
-          <w:kern w:val="0"/>
-          <w14:ligatures w14:val="none"/>
-        </w:rPr>
-        <w:t>graph.json</w:t>
-      </w:r>
-      <w:proofErr w:type="spellEnd"/>
-      <w:proofErr w:type="gramEnd"/>
-      <w:r>
-        <w:rPr>
-          <w:rFonts w:ascii="Times New Roman" w:eastAsia="Times New Roman" w:hAnsi="Times New Roman" w:cs="Times New Roman"/>
-          <w:kern w:val="0"/>
-          <w14:ligatures w14:val="none"/>
-        </w:rPr>
-        <w:t xml:space="preserve"> + evidence coverage report</w:t>
+        <w:t>Output: evidence_graph.json + evidence coverage report</w:t>
       </w:r>
     </w:p>
     <w:p>
@@ -1233,18 +1150,9 @@
           <w:rFonts w:ascii="Times New Roman" w:eastAsia="Times New Roman" w:hAnsi="Times New Roman" w:cs="Times New Roman"/>
           <w:noProof/>
           <w:kern w:val="0"/>
-          <w14:ligatures w14:val="none"/>
-        </w:rPr>
-      </w:r>
-      <w:r>
-        <w:rPr>
-          <w:rFonts w:ascii="Times New Roman" w:eastAsia="Times New Roman" w:hAnsi="Times New Roman" w:cs="Times New Roman"/>
-          <w:noProof/>
-          <w:kern w:val="0"/>
-          <w14:ligatures w14:val="none"/>
-        </w:rPr>
-        <w:pict w14:anchorId="54E47A2A">
-          <v:rect id="_x0000_i1030" alt="" style="width:468pt;height:.05pt;mso-width-percent:0;mso-height-percent:0;mso-width-percent:0;mso-height-percent:0" o:hralign="center" o:hrstd="t" o:hr="t" fillcolor="#a0a0a0" stroked="f"/>
+        </w:rPr>
+        <w:pict w14:anchorId="5C3829E2">
+          <v:rect id="_x0000_i1031" alt="" style="width:468pt;height:.05pt;mso-width-percent:0;mso-height-percent:0;mso-width-percent:0;mso-height-percent:0" o:hralign="center" o:hrstd="t" o:hr="t" fillcolor="#a0a0a0" stroked="f"/>
         </w:pict>
       </w:r>
     </w:p>
@@ -1336,28 +1244,9 @@
           <w:kern w:val="0"/>
           <w14:ligatures w14:val="none"/>
         </w:rPr>
-        <w:t xml:space="preserve">Output: </w:t>
-      </w:r>
-      <w:proofErr w:type="spellStart"/>
-      <w:r>
-        <w:rPr>
-          <w:rFonts w:ascii="Times New Roman" w:eastAsia="Times New Roman" w:hAnsi="Times New Roman" w:cs="Times New Roman"/>
-          <w:kern w:val="0"/>
-          <w14:ligatures w14:val="none"/>
-        </w:rPr>
-        <w:t>job_</w:t>
-      </w:r>
-      <w:proofErr w:type="gramStart"/>
-      <w:r>
-        <w:rPr>
-          <w:rFonts w:ascii="Times New Roman" w:eastAsia="Times New Roman" w:hAnsi="Times New Roman" w:cs="Times New Roman"/>
-          <w:kern w:val="0"/>
-          <w14:ligatures w14:val="none"/>
-        </w:rPr>
-        <w:t>requirements.json</w:t>
-      </w:r>
-      <w:proofErr w:type="spellEnd"/>
-      <w:proofErr w:type="gramEnd"/>
+        <w:lastRenderedPageBreak/>
+        <w:t>Output: job_requirements.json</w:t>
+      </w:r>
     </w:p>
     <w:p>
       <w:pPr>
@@ -1398,7 +1287,6 @@
           <w:kern w:val="0"/>
           <w14:ligatures w14:val="none"/>
         </w:rPr>
-        <w:lastRenderedPageBreak/>
         <w:t>F8. Retrieval of Templates / Career Knowledge Pack (STAR, letter patterns) — Value: 3/5</w:t>
       </w:r>
     </w:p>
@@ -1482,18 +1370,9 @@
           <w:rFonts w:ascii="Times New Roman" w:eastAsia="Times New Roman" w:hAnsi="Times New Roman" w:cs="Times New Roman"/>
           <w:noProof/>
           <w:kern w:val="0"/>
-          <w14:ligatures w14:val="none"/>
-        </w:rPr>
-      </w:r>
-      <w:r>
-        <w:rPr>
-          <w:rFonts w:ascii="Times New Roman" w:eastAsia="Times New Roman" w:hAnsi="Times New Roman" w:cs="Times New Roman"/>
-          <w:noProof/>
-          <w:kern w:val="0"/>
-          <w14:ligatures w14:val="none"/>
-        </w:rPr>
-        <w:pict w14:anchorId="5C2F81E3">
-          <v:rect id="_x0000_i1031" alt="" style="width:468pt;height:.05pt;mso-width-percent:0;mso-height-percent:0;mso-width-percent:0;mso-height-percent:0" o:hralign="center" o:hrstd="t" o:hr="t" fillcolor="#a0a0a0" stroked="f"/>
+        </w:rPr>
+        <w:pict w14:anchorId="270DB774">
+          <v:rect id="_x0000_i1030" alt="" style="width:468pt;height:.05pt;mso-width-percent:0;mso-height-percent:0;mso-width-percent:0;mso-height-percent:0" o:hralign="center" o:hrstd="t" o:hr="t" fillcolor="#a0a0a0" stroked="f"/>
         </w:pict>
       </w:r>
     </w:p>
@@ -1585,28 +1464,8 @@
           <w:kern w:val="0"/>
           <w14:ligatures w14:val="none"/>
         </w:rPr>
-        <w:t xml:space="preserve">Output: </w:t>
-      </w:r>
-      <w:proofErr w:type="spellStart"/>
-      <w:r>
-        <w:rPr>
-          <w:rFonts w:ascii="Times New Roman" w:eastAsia="Times New Roman" w:hAnsi="Times New Roman" w:cs="Times New Roman"/>
-          <w:kern w:val="0"/>
-          <w14:ligatures w14:val="none"/>
-        </w:rPr>
-        <w:t>eligibility_</w:t>
-      </w:r>
-      <w:proofErr w:type="gramStart"/>
-      <w:r>
-        <w:rPr>
-          <w:rFonts w:ascii="Times New Roman" w:eastAsia="Times New Roman" w:hAnsi="Times New Roman" w:cs="Times New Roman"/>
-          <w:kern w:val="0"/>
-          <w14:ligatures w14:val="none"/>
-        </w:rPr>
-        <w:t>report.json</w:t>
-      </w:r>
-      <w:proofErr w:type="spellEnd"/>
-      <w:proofErr w:type="gramEnd"/>
+        <w:t>Output: eligibility_report.json</w:t>
+      </w:r>
     </w:p>
     <w:p>
       <w:pPr>
@@ -1730,18 +1589,9 @@
           <w:rFonts w:ascii="Times New Roman" w:eastAsia="Times New Roman" w:hAnsi="Times New Roman" w:cs="Times New Roman"/>
           <w:noProof/>
           <w:kern w:val="0"/>
-          <w14:ligatures w14:val="none"/>
-        </w:rPr>
-      </w:r>
-      <w:r>
-        <w:rPr>
-          <w:rFonts w:ascii="Times New Roman" w:eastAsia="Times New Roman" w:hAnsi="Times New Roman" w:cs="Times New Roman"/>
-          <w:noProof/>
-          <w:kern w:val="0"/>
-          <w14:ligatures w14:val="none"/>
-        </w:rPr>
-        <w:pict w14:anchorId="2596B922">
-          <v:rect id="_x0000_i1032" alt="" style="width:468pt;height:.05pt;mso-width-percent:0;mso-height-percent:0;mso-width-percent:0;mso-height-percent:0" o:hralign="center" o:hrstd="t" o:hr="t" fillcolor="#a0a0a0" stroked="f"/>
+        </w:rPr>
+        <w:pict w14:anchorId="2B0A24DA">
+          <v:rect id="_x0000_i1029" alt="" style="width:468pt;height:.05pt;mso-width-percent:0;mso-height-percent:0;mso-width-percent:0;mso-height-percent:0" o:hralign="center" o:hrstd="t" o:hr="t" fillcolor="#a0a0a0" stroked="f"/>
         </w:pict>
       </w:r>
     </w:p>
@@ -2027,6 +1877,7 @@
           <w:kern w:val="0"/>
           <w14:ligatures w14:val="none"/>
         </w:rPr>
+        <w:lastRenderedPageBreak/>
         <w:t>Value: helpful but not necessary for first proof</w:t>
       </w:r>
     </w:p>
@@ -2044,18 +1895,9 @@
           <w:rFonts w:ascii="Times New Roman" w:eastAsia="Times New Roman" w:hAnsi="Times New Roman" w:cs="Times New Roman"/>
           <w:noProof/>
           <w:kern w:val="0"/>
-          <w14:ligatures w14:val="none"/>
-        </w:rPr>
-      </w:r>
-      <w:r>
-        <w:rPr>
-          <w:rFonts w:ascii="Times New Roman" w:eastAsia="Times New Roman" w:hAnsi="Times New Roman" w:cs="Times New Roman"/>
-          <w:noProof/>
-          <w:kern w:val="0"/>
-          <w14:ligatures w14:val="none"/>
-        </w:rPr>
-        <w:pict w14:anchorId="224914C3">
-          <v:rect id="_x0000_i1033" alt="" style="width:468pt;height:.05pt;mso-width-percent:0;mso-height-percent:0;mso-width-percent:0;mso-height-percent:0" o:hralign="center" o:hrstd="t" o:hr="t" fillcolor="#a0a0a0" stroked="f"/>
+        </w:rPr>
+        <w:pict w14:anchorId="562FB49A">
+          <v:rect id="_x0000_i1028" alt="" style="width:468pt;height:.05pt;mso-width-percent:0;mso-height-percent:0;mso-width-percent:0;mso-height-percent:0" o:hralign="center" o:hrstd="t" o:hr="t" fillcolor="#a0a0a0" stroked="f"/>
         </w:pict>
       </w:r>
     </w:p>
@@ -2083,7 +1925,6 @@
           <w:szCs w:val="36"/>
           <w14:ligatures w14:val="none"/>
         </w:rPr>
-        <w:lastRenderedPageBreak/>
         <w:t>L7 — Guardrails + Governance Layer</w:t>
       </w:r>
     </w:p>
@@ -2320,27 +2161,7 @@
           <w:kern w:val="0"/>
           <w14:ligatures w14:val="none"/>
         </w:rPr>
-        <w:t xml:space="preserve">Output: </w:t>
-      </w:r>
-      <w:proofErr w:type="spellStart"/>
-      <w:proofErr w:type="gramStart"/>
-      <w:r>
-        <w:rPr>
-          <w:rFonts w:ascii="Times New Roman" w:eastAsia="Times New Roman" w:hAnsi="Times New Roman" w:cs="Times New Roman"/>
-          <w:kern w:val="0"/>
-          <w14:ligatures w14:val="none"/>
-        </w:rPr>
-        <w:t>audit.json</w:t>
-      </w:r>
-      <w:proofErr w:type="spellEnd"/>
-      <w:proofErr w:type="gramEnd"/>
-      <w:r>
-        <w:rPr>
-          <w:rFonts w:ascii="Times New Roman" w:eastAsia="Times New Roman" w:hAnsi="Times New Roman" w:cs="Times New Roman"/>
-          <w:kern w:val="0"/>
-          <w14:ligatures w14:val="none"/>
-        </w:rPr>
-        <w:t xml:space="preserve"> for traceability</w:t>
+        <w:t>Output: audit.json for traceability</w:t>
       </w:r>
     </w:p>
     <w:p>
@@ -2379,18 +2200,9 @@
           <w:rFonts w:ascii="Times New Roman" w:eastAsia="Times New Roman" w:hAnsi="Times New Roman" w:cs="Times New Roman"/>
           <w:noProof/>
           <w:kern w:val="0"/>
-          <w14:ligatures w14:val="none"/>
-        </w:rPr>
-      </w:r>
-      <w:r>
-        <w:rPr>
-          <w:rFonts w:ascii="Times New Roman" w:eastAsia="Times New Roman" w:hAnsi="Times New Roman" w:cs="Times New Roman"/>
-          <w:noProof/>
-          <w:kern w:val="0"/>
-          <w14:ligatures w14:val="none"/>
-        </w:rPr>
-        <w:pict w14:anchorId="68AE3449">
-          <v:rect id="_x0000_i1034" alt="" style="width:468pt;height:.05pt;mso-width-percent:0;mso-height-percent:0;mso-width-percent:0;mso-height-percent:0" o:hralign="center" o:hrstd="t" o:hr="t" fillcolor="#a0a0a0" stroked="f"/>
+        </w:rPr>
+        <w:pict w14:anchorId="6B6CD3CD">
+          <v:rect id="_x0000_i1027" alt="" style="width:468pt;height:.05pt;mso-width-percent:0;mso-height-percent:0;mso-width-percent:0;mso-height-percent:0" o:hralign="center" o:hrstd="t" o:hr="t" fillcolor="#a0a0a0" stroked="f"/>
         </w:pict>
       </w:r>
     </w:p>
@@ -2607,18 +2419,9 @@
           <w:rFonts w:ascii="Times New Roman" w:eastAsia="Times New Roman" w:hAnsi="Times New Roman" w:cs="Times New Roman"/>
           <w:noProof/>
           <w:kern w:val="0"/>
-          <w14:ligatures w14:val="none"/>
-        </w:rPr>
-      </w:r>
-      <w:r>
-        <w:rPr>
-          <w:rFonts w:ascii="Times New Roman" w:eastAsia="Times New Roman" w:hAnsi="Times New Roman" w:cs="Times New Roman"/>
-          <w:noProof/>
-          <w:kern w:val="0"/>
-          <w14:ligatures w14:val="none"/>
-        </w:rPr>
-        <w:pict w14:anchorId="7E18BE3D">
-          <v:rect id="_x0000_i1035" alt="" style="width:468pt;height:.05pt;mso-width-percent:0;mso-height-percent:0;mso-width-percent:0;mso-height-percent:0" o:hralign="center" o:hrstd="t" o:hr="t" fillcolor="#a0a0a0" stroked="f"/>
+        </w:rPr>
+        <w:pict w14:anchorId="647DBD04">
+          <v:rect id="_x0000_i1026" alt="" style="width:468pt;height:.05pt;mso-width-percent:0;mso-height-percent:0;mso-width-percent:0;mso-height-percent:0" o:hralign="center" o:hrstd="t" o:hr="t" fillcolor="#a0a0a0" stroked="f"/>
         </w:pict>
       </w:r>
     </w:p>
@@ -2646,75 +2449,27 @@
           <w:szCs w:val="36"/>
           <w14:ligatures w14:val="none"/>
         </w:rPr>
-        <w:t>L9 — Platform Ops Layer (</w:t>
-      </w:r>
-      <w:proofErr w:type="spellStart"/>
+        <w:t>L9 — Platform Ops Layer (MLOps, CI/CD, Observability)</w:t>
+      </w:r>
+    </w:p>
+    <w:p>
+      <w:pPr>
+        <w:spacing w:before="100" w:beforeAutospacing="1" w:after="100" w:afterAutospacing="1" w:line="240" w:lineRule="auto"/>
+        <w:rPr>
+          <w:rFonts w:ascii="Times New Roman" w:eastAsia="Times New Roman" w:hAnsi="Times New Roman" w:cs="Times New Roman"/>
+          <w:kern w:val="0"/>
+          <w14:ligatures w14:val="none"/>
+        </w:rPr>
+      </w:pPr>
       <w:r>
         <w:rPr>
           <w:rFonts w:ascii="Times New Roman" w:eastAsia="Times New Roman" w:hAnsi="Times New Roman" w:cs="Times New Roman"/>
           <w:b/>
           <w:bCs/>
           <w:kern w:val="0"/>
-          <w:sz w:val="36"/>
-          <w:szCs w:val="36"/>
-          <w14:ligatures w14:val="none"/>
-        </w:rPr>
-        <w:t>MLOps</w:t>
-      </w:r>
-      <w:proofErr w:type="spellEnd"/>
-      <w:r>
-        <w:rPr>
-          <w:rFonts w:ascii="Times New Roman" w:eastAsia="Times New Roman" w:hAnsi="Times New Roman" w:cs="Times New Roman"/>
-          <w:b/>
-          <w:bCs/>
-          <w:kern w:val="0"/>
-          <w:sz w:val="36"/>
-          <w:szCs w:val="36"/>
-          <w14:ligatures w14:val="none"/>
-        </w:rPr>
-        <w:t>, CI/CD, Observability)</w:t>
-      </w:r>
-    </w:p>
-    <w:p>
-      <w:pPr>
-        <w:spacing w:before="100" w:beforeAutospacing="1" w:after="100" w:afterAutospacing="1" w:line="240" w:lineRule="auto"/>
-        <w:rPr>
-          <w:rFonts w:ascii="Times New Roman" w:eastAsia="Times New Roman" w:hAnsi="Times New Roman" w:cs="Times New Roman"/>
-          <w:kern w:val="0"/>
-          <w14:ligatures w14:val="none"/>
-        </w:rPr>
-      </w:pPr>
-      <w:r>
-        <w:rPr>
-          <w:rFonts w:ascii="Times New Roman" w:eastAsia="Times New Roman" w:hAnsi="Times New Roman" w:cs="Times New Roman"/>
-          <w:b/>
-          <w:bCs/>
-          <w:kern w:val="0"/>
-          <w14:ligatures w14:val="none"/>
-        </w:rPr>
-        <w:t>F19. Experiment Tracking (</w:t>
-      </w:r>
-      <w:proofErr w:type="spellStart"/>
-      <w:r>
-        <w:rPr>
-          <w:rFonts w:ascii="Times New Roman" w:eastAsia="Times New Roman" w:hAnsi="Times New Roman" w:cs="Times New Roman"/>
-          <w:b/>
-          <w:bCs/>
-          <w:kern w:val="0"/>
-          <w14:ligatures w14:val="none"/>
-        </w:rPr>
-        <w:t>MLflow</w:t>
-      </w:r>
-      <w:proofErr w:type="spellEnd"/>
-      <w:r>
-        <w:rPr>
-          <w:rFonts w:ascii="Times New Roman" w:eastAsia="Times New Roman" w:hAnsi="Times New Roman" w:cs="Times New Roman"/>
-          <w:b/>
-          <w:bCs/>
-          <w:kern w:val="0"/>
-          <w14:ligatures w14:val="none"/>
-        </w:rPr>
-        <w:t>) — Value: 3/5</w:t>
+          <w14:ligatures w14:val="none"/>
+        </w:rPr>
+        <w:t>F19. Experiment Tracking (MLflow) — Value: 3/5</w:t>
       </w:r>
     </w:p>
     <w:p>
@@ -2736,6 +2491,7 @@
           <w:kern w:val="0"/>
           <w14:ligatures w14:val="none"/>
         </w:rPr>
+        <w:lastRenderedPageBreak/>
         <w:t>Value: reproducibility and iteration; important for engineering maturity</w:t>
       </w:r>
     </w:p>
@@ -2778,7 +2534,6 @@
           <w:kern w:val="0"/>
           <w14:ligatures w14:val="none"/>
         </w:rPr>
-        <w:lastRenderedPageBreak/>
         <w:t>Value: repeatable datasets and artifact history</w:t>
       </w:r>
     </w:p>
@@ -2964,18 +2719,9 @@
           <w:rFonts w:ascii="Times New Roman" w:eastAsia="Times New Roman" w:hAnsi="Times New Roman" w:cs="Times New Roman"/>
           <w:noProof/>
           <w:kern w:val="0"/>
-          <w14:ligatures w14:val="none"/>
-        </w:rPr>
-      </w:r>
-      <w:r>
-        <w:rPr>
-          <w:rFonts w:ascii="Times New Roman" w:eastAsia="Times New Roman" w:hAnsi="Times New Roman" w:cs="Times New Roman"/>
-          <w:noProof/>
-          <w:kern w:val="0"/>
-          <w14:ligatures w14:val="none"/>
-        </w:rPr>
-        <w:pict w14:anchorId="164735AE">
-          <v:rect id="_x0000_i1036" alt="" style="width:468pt;height:.05pt;mso-width-percent:0;mso-height-percent:0;mso-width-percent:0;mso-height-percent:0" o:hralign="center" o:hrstd="t" o:hr="t" fillcolor="#a0a0a0" stroked="f"/>
+        </w:rPr>
+        <w:pict w14:anchorId="3A177F1A">
+          <v:rect id="_x0000_i1025" alt="" style="width:468pt;height:.05pt;mso-width-percent:0;mso-height-percent:0;mso-width-percent:0;mso-height-percent:0" o:hralign="center" o:hrstd="t" o:hr="t" fillcolor="#a0a0a0" stroked="f"/>
         </w:pict>
       </w:r>
     </w:p>

</xml_diff>